<commit_message>
Masters QA pass (7-point): official-sources-only claims, UK spelling normalised, banned phrase + quotes fixed; all 50 DOCX regenerated
Co-authored-by: arena-agent <297053741+arena-agent@users.noreply.github.com>
</commit_message>
<xml_diff>
--- a/landing-page/program-detail/girne-american-university/executive-mba/02-emba-in-media-and-entertainment.docx
+++ b/landing-page/program-detail/girne-american-university/executive-mba/02-emba-in-media-and-entertainment.docx
@@ -336,7 +336,7 @@
     </w:p>
     <w:p>
       <w:r>
-        <w:t>Media executives learn the creative side by living it; the business side usually arrives through mistakes. This Executive MBA closes that gap. The executive core covers strategy, finance, human resources, and operations, then the coursework turns toward the media and communication industry itself: how audiences behave, how events get planned and budgeted, how brands get built across platforms, and how creative organizations get managed without killing the thing that makes them creative.</w:t>
+        <w:t>Media executives learn the creative side by living it; the business side usually arrives through mistakes. This Executive MBA closes that gap. The executive core covers strategy, finance, human resources, and operations, then the coursework turns toward the media and communication industry itself: how audiences behave, how events get planned and budgeted, how brands get built across platforms, and how creative organisations get managed without killing the thing that makes them creative.</w:t>
       </w:r>
     </w:p>
     <w:p>
@@ -699,7 +699,7 @@
         <w:pStyle w:val="ListBullet"/>
       </w:pPr>
       <w:r>
-        <w:t>A supervised investigation of a media business question, often drawn from the participant's own organization</w:t>
+        <w:t>A supervised investigation of a media business question, often drawn from the participant's own organisation</w:t>
       </w:r>
     </w:p>
     <w:p>
@@ -914,7 +914,7 @@
     </w:p>
     <w:p>
       <w:r>
-        <w:t>Fully online, no visa, no career break. UAE digital advertising was worth USD 2.29 billion in 2025 and is forecast to reach USD 5.35 billion by 2031, and the content economy behind it keeps widening.</w:t>
+        <w:t>Fully online, no visa, no career break. Advertising budgets across the UAE keep shifting toward digital, and the content economy behind them keeps widening.</w:t>
       </w:r>
     </w:p>
     <w:p>
@@ -953,7 +953,7 @@
     </w:p>
     <w:p>
       <w:r>
-        <w:t>Taggd's 2026 GCC study reports nine in ten employers struggling to find qualified candidates, and media companies report the shortage most sharply in commercial roles.</w:t>
+        <w:t>Across the Gulf, employers keep reporting shortages of qualified candidates, and media companies report the shortage most sharply in commercial roles.</w:t>
       </w:r>
     </w:p>
     <w:p>

</xml_diff>